<commit_message>
Formatage cohérent des références de documents
</commit_message>
<xml_diff>
--- a/_demos/Demo_EXC.docx
+++ b/_demos/Demo_EXC.docx
@@ -1207,7 +1207,23 @@
                 <w:sz w:val="22"/>
                 <w:szCs w:val="22"/>
               </w:rPr>
-              <w:t xml:space="preserve">on vient de faire pire qu'avant. Le plantage était bruyant mais honnête ; ce silence est un mensonge. Voir CC-ERR.3.</w:t>
+              <w:t xml:space="preserve">on vient de faire pire qu'avant. Le plantage était bruyant mais honnête ; ce silence est un mensonge. Voir </w:t>
+            </w:r>
+            <w:r>
+              <w:rPr>
+                <w:rFonts w:ascii="Consolas" w:hAnsi="Consolas" w:cs="Consolas"/>
+                <w:color w:val="E97132" w:themeColor="accent2"/>
+                <w:sz w:val="18"/>
+                <w:szCs w:val="18"/>
+              </w:rPr>
+              <w:t xml:space="preserve">CC-ERR.3</w:t>
+            </w:r>
+            <w:r>
+              <w:rPr>
+                <w:sz w:val="22"/>
+                <w:szCs w:val="22"/>
+              </w:rPr>
+              <w:t xml:space="preserve">.</w:t>
             </w:r>
           </w:p>
         </w:tc>
@@ -1327,6 +1343,7 @@
                 <w:color w:val="E97132" w:themeColor="accent2"/>
                 <w:sz w:val="18"/>
                 <w:szCs w:val="18"/>
+                <w:u w:val="none"/>
               </w:rPr>
               <w:t xml:space="preserve">CC-ERR.1</w:t>
             </w:r>
@@ -1380,6 +1397,7 @@
                 <w:color w:val="E97132" w:themeColor="accent2"/>
                 <w:sz w:val="18"/>
                 <w:szCs w:val="18"/>
+                <w:u w:val="none"/>
               </w:rPr>
               <w:t xml:space="preserve">CC-ERR.3</w:t>
             </w:r>
@@ -1433,6 +1451,7 @@
                 <w:color w:val="E97132" w:themeColor="accent2"/>
                 <w:sz w:val="18"/>
                 <w:szCs w:val="18"/>
+                <w:u w:val="none"/>
               </w:rPr>
               <w:t xml:space="preserve">CC-ERR.4</w:t>
             </w:r>

</xml_diff>